<commit_message>
docs: 同步简介.docx（build_promo_docx.py 重新生成，含 v4.1 format-converter 内容）
</commit_message>
<xml_diff>
--- a/docs/简介.docx
+++ b/docs/简介.docx
@@ -293,6 +293,24 @@
     </w:p>
     <w:p>
       <w:pPr>
+        <w:numPr>
+          <w:ilvl w:val="0"/>
+          <w:numId w:val="10"/>
+        </w:numPr>
+        <w:spacing w:after="80" w:line="300" w:lineRule="auto"/>
+      </w:pPr>
+      <w:r>
+        <w:rPr>
+          <w:rFonts w:ascii="Calibri" w:hAnsi="Calibri" w:eastAsia="Heiti SC"/>
+          <w:b w:val="0"/>
+          <w:i w:val="0"/>
+          <w:sz w:val="22"/>
+        </w:rPr>
+        <w:t>格式预处理：docx / pdf / html / csv / 扫描件图片先经内置 format-converter 转成 txt / md / json 再脱敏（判决书 PDF、网上复制的裁判文书、当事人名单等）</w:t>
+      </w:r>
+    </w:p>
+    <w:p>
+      <w:pPr>
         <w:pStyle w:val="Heading1"/>
         <w:spacing w:before="360" w:after="200"/>
       </w:pPr>
@@ -552,6 +570,33 @@
     </w:p>
     <w:p>
       <w:pPr>
+        <w:numPr>
+          <w:ilvl w:val="0"/>
+          <w:numId w:val="11"/>
+        </w:numPr>
+        <w:spacing w:after="80" w:line="300" w:lineRule="auto"/>
+      </w:pPr>
+      <w:r>
+        <w:rPr>
+          <w:rFonts w:ascii="Calibri" w:hAnsi="Calibri" w:eastAsia="Heiti SC"/>
+          <w:b/>
+          <w:i w:val="0"/>
+          <w:sz w:val="22"/>
+        </w:rPr>
+        <w:t>内置格式转换 format-converter（v4.1）：</w:t>
+      </w:r>
+      <w:r>
+        <w:rPr>
+          <w:rFonts w:ascii="Calibri" w:hAnsi="Calibri" w:eastAsia="Heiti SC"/>
+          <w:b w:val="0"/>
+          <w:i w:val="0"/>
+          <w:sz w:val="22"/>
+        </w:rPr>
+        <w:t>纯 JS 无外部引擎：docx（mammoth）/ pdf（pdfjs-dist）/ 文本互转（turndown、marked、csv-parse）/ 图片（sharp）全部本地处理，npm install 即可用。扩充脱敏输入链路：判决书 PDF → txt、网上复制的裁判文书 HTML → md、律师文书 docx → txt、当事人名单 csv → json、扫描件图片 → pdf。扫描件/图片型 PDF 无文本层时明确报错并指引走 OCR 通道，不静默产出空文件；刻意排除与脱敏无关的转换（音视频 / NCM / ZIP / Office 全格式），保持轻量。来源 FlyingMouse Format（MIT）。</w:t>
+      </w:r>
+    </w:p>
+    <w:p>
+      <w:pPr>
         <w:pStyle w:val="Heading1"/>
         <w:spacing w:before="360" w:after="200"/>
       </w:pPr>
@@ -616,6 +661,22 @@
     </w:p>
     <w:p>
       <w:pPr>
+        <w:spacing w:before="0" w:after="0" w:line="240" w:lineRule="auto"/>
+        <w:ind w:left="288"/>
+        <w:shd w:val="clear" w:color="auto" w:fill="F2F4F7"/>
+      </w:pPr>
+      <w:r>
+        <w:rPr>
+          <w:rFonts w:ascii="Consolas" w:hAnsi="Consolas" w:eastAsia="Heiti SC"/>
+          <w:b w:val="0"/>
+          <w:i w:val="0"/>
+          <w:sz w:val="19"/>
+        </w:rPr>
+        <w:t>pip3 install -r requirements.txt   # jieba 必装；docx/pdf/加密为可选</w:t>
+      </w:r>
+    </w:p>
+    <w:p>
+      <w:pPr>
         <w:spacing w:before="0" w:after="120" w:line="240" w:lineRule="auto"/>
         <w:ind w:left="288"/>
         <w:shd w:val="clear" w:color="auto" w:fill="F2F4F7"/>
@@ -627,7 +688,7 @@
           <w:i w:val="0"/>
           <w:sz w:val="19"/>
         </w:rPr>
-        <w:t>pip3 install -r requirements.txt   # jieba 必装；docx/pdf/加密为可选</w:t>
+        <w:t>cd format-converter &amp;&amp; npm install &amp;&amp; cd ..   # 格式转换核心（可选，需 node &gt;= 22.13）</w:t>
       </w:r>
     </w:p>
     <w:p>
@@ -649,6 +710,101 @@
     <w:p>
       <w:pPr>
         <w:spacing w:before="120" w:after="0" w:line="240" w:lineRule="auto"/>
+        <w:ind w:left="288"/>
+        <w:shd w:val="clear" w:color="auto" w:fill="F2F4F7"/>
+      </w:pPr>
+      <w:r>
+        <w:rPr>
+          <w:rFonts w:ascii="Consolas" w:hAnsi="Consolas" w:eastAsia="Heiti SC"/>
+          <w:b w:val="0"/>
+          <w:i w:val="0"/>
+          <w:sz w:val="19"/>
+        </w:rPr>
+        <w:t># 格式预处理（format-converter，可选）：docx/pdf/html/csv/图片 → txt/md/json</w:t>
+      </w:r>
+    </w:p>
+    <w:p>
+      <w:pPr>
+        <w:spacing w:before="0" w:after="0" w:line="240" w:lineRule="auto"/>
+        <w:ind w:left="288"/>
+        <w:shd w:val="clear" w:color="auto" w:fill="F2F4F7"/>
+      </w:pPr>
+      <w:r>
+        <w:rPr>
+          <w:rFonts w:ascii="Consolas" w:hAnsi="Consolas" w:eastAsia="Heiti SC"/>
+          <w:b w:val="0"/>
+          <w:i w:val="0"/>
+          <w:sz w:val="19"/>
+        </w:rPr>
+        <w:t>node format-converter/cli.js 判决书.pdf txt -o 判决书.txt</w:t>
+      </w:r>
+    </w:p>
+    <w:p>
+      <w:pPr>
+        <w:spacing w:before="0" w:after="0" w:line="240" w:lineRule="auto"/>
+        <w:ind w:left="288"/>
+        <w:shd w:val="clear" w:color="auto" w:fill="F2F4F7"/>
+      </w:pPr>
+      <w:r>
+        <w:rPr>
+          <w:rFonts w:ascii="Consolas" w:hAnsi="Consolas" w:eastAsia="Heiti SC"/>
+          <w:b w:val="0"/>
+          <w:i w:val="0"/>
+          <w:sz w:val="19"/>
+        </w:rPr>
+        <w:t>node format-converter/cli.js 合同.docx txt -o 合同.txt</w:t>
+      </w:r>
+    </w:p>
+    <w:p>
+      <w:pPr>
+        <w:spacing w:before="0" w:after="0" w:line="240" w:lineRule="auto"/>
+        <w:ind w:left="288"/>
+        <w:shd w:val="clear" w:color="auto" w:fill="F2F4F7"/>
+      </w:pPr>
+      <w:r>
+        <w:rPr>
+          <w:rFonts w:ascii="Consolas" w:hAnsi="Consolas" w:eastAsia="Heiti SC"/>
+          <w:b w:val="0"/>
+          <w:i w:val="0"/>
+          <w:sz w:val="19"/>
+        </w:rPr>
+        <w:t>node format-converter/cli.js 裁判文书.html md</w:t>
+      </w:r>
+    </w:p>
+    <w:p>
+      <w:pPr>
+        <w:spacing w:before="0" w:after="0" w:line="240" w:lineRule="auto"/>
+        <w:ind w:left="288"/>
+        <w:shd w:val="clear" w:color="auto" w:fill="F2F4F7"/>
+      </w:pPr>
+      <w:r>
+        <w:rPr>
+          <w:rFonts w:ascii="Consolas" w:hAnsi="Consolas" w:eastAsia="Heiti SC"/>
+          <w:b w:val="0"/>
+          <w:i w:val="0"/>
+          <w:sz w:val="19"/>
+        </w:rPr>
+        <w:t>node format-converter/cli.js 当事人.csv json</w:t>
+      </w:r>
+    </w:p>
+    <w:p>
+      <w:pPr>
+        <w:spacing w:before="0" w:after="0" w:line="240" w:lineRule="auto"/>
+        <w:ind w:left="288"/>
+        <w:shd w:val="clear" w:color="auto" w:fill="F2F4F7"/>
+      </w:pPr>
+      <w:r>
+        <w:rPr>
+          <w:rFonts w:ascii="Consolas" w:hAnsi="Consolas" w:eastAsia="Heiti SC"/>
+          <w:b w:val="0"/>
+          <w:i w:val="0"/>
+          <w:sz w:val="19"/>
+        </w:rPr>
+      </w:r>
+    </w:p>
+    <w:p>
+      <w:pPr>
+        <w:spacing w:before="0" w:after="0" w:line="240" w:lineRule="auto"/>
         <w:ind w:left="288"/>
         <w:shd w:val="clear" w:color="auto" w:fill="F2F4F7"/>
       </w:pPr>
@@ -1473,6 +1629,24 @@
           <w:sz w:val="22"/>
         </w:rPr>
         <w:t>格式保真有限：docx 保留段落结构；PDF 输出为纯文本。</w:t>
+      </w:r>
+    </w:p>
+    <w:p>
+      <w:pPr>
+        <w:numPr>
+          <w:ilvl w:val="0"/>
+          <w:numId w:val="13"/>
+        </w:numPr>
+        <w:spacing w:after="80" w:line="300" w:lineRule="auto"/>
+      </w:pPr>
+      <w:r>
+        <w:rPr>
+          <w:rFonts w:ascii="Calibri" w:hAnsi="Calibri" w:eastAsia="Heiti SC"/>
+          <w:b w:val="0"/>
+          <w:i w:val="0"/>
+          <w:sz w:val="22"/>
+        </w:rPr>
+        <w:t>format-converter 只做文本层提取：docx→txt/md 依赖 mammoth（不解析复杂宏/嵌入对象），pdf→txt 仅限带文本层的电子版文书；扫描件 PDF 需先走 OCR 通道（macOS Vision 内置 / Windows/Linux 外部 OCR），图片型材料转 PDF 后脱敏效果取决于 OCR 识别率。</w:t>
       </w:r>
     </w:p>
     <w:p>
@@ -2680,6 +2854,52 @@
           </w:p>
         </w:tc>
       </w:tr>
+      <w:tr>
+        <w:tc>
+          <w:tcPr>
+            <w:tcW w:type="dxa" w:w="4680"/>
+            <w:vAlign w:val="center"/>
+            <w:tcW w:w="1655"/>
+          </w:tcPr>
+          <w:p>
+            <w:pPr>
+              <w:spacing w:before="40" w:after="40" w:line="276" w:lineRule="auto"/>
+              <w:jc w:val="left"/>
+            </w:pPr>
+            <w:r>
+              <w:rPr>
+                <w:rFonts w:ascii="Calibri" w:hAnsi="Calibri" w:eastAsia="Heiti SC"/>
+                <w:b w:val="0"/>
+                <w:i w:val="0"/>
+                <w:sz w:val="20"/>
+              </w:rPr>
+              <w:t>v4.1</w:t>
+            </w:r>
+          </w:p>
+        </w:tc>
+        <w:tc>
+          <w:tcPr>
+            <w:tcW w:type="dxa" w:w="4680"/>
+            <w:vAlign w:val="center"/>
+            <w:tcW w:w="7703"/>
+          </w:tcPr>
+          <w:p>
+            <w:pPr>
+              <w:spacing w:before="40" w:after="40" w:line="276" w:lineRule="auto"/>
+              <w:jc w:val="left"/>
+            </w:pPr>
+            <w:r>
+              <w:rPr>
+                <w:rFonts w:ascii="Calibri" w:hAnsi="Calibri" w:eastAsia="Heiti SC"/>
+                <w:b w:val="0"/>
+                <w:i w:val="0"/>
+                <w:sz w:val="20"/>
+              </w:rPr>
+              <w:t>内置 format-converter 格式转换核心：docx / pdf / html / csv / 图片 → txt / md / json，纯 JS 无外部引擎（mammoth / pdfjs-dist / turndown / marked / csv-parse / sharp），扩充脱敏输入链路；来源 FlyingMouse Format（MIT）</w:t>
+            </w:r>
+          </w:p>
+        </w:tc>
+      </w:tr>
     </w:tbl>
     <w:p>
       <w:pPr>

</xml_diff>